<commit_message>
Add link to prototype demo video in docs
</commit_message>
<xml_diff>
--- a/docs/CP5_Respira+_Documentacao.docx
+++ b/docs/CP5_Respira+_Documentacao.docx
@@ -2855,13 +2855,14 @@
       <w:pPr>
         <w:spacing w:after="220"/>
       </w:pPr>
-      <w:r>
-        <w:rPr>
-          <w:i/>
-          <w:color w:val="B8860B"/>
-        </w:rPr>
-        <w:t xml:space="preserve">[Link do vídeo de demonstração — a adicionar após a gravação]</w:t>
-      </w:r>
+      <w:hyperlink r:id="rId21" w:history="1">
+        <w:r>
+          <w:rPr>
+            <w:rStyle w:val="Hyperlink"/>
+          </w:rPr>
+          <w:t>Vídeo de simulação funcional — YouTube</w:t>
+        </w:r>
+      </w:hyperlink>
     </w:p>
     <w:p>
       <w:pPr>

</xml_diff>

<commit_message>
Add link to presentation video in docs
</commit_message>
<xml_diff>
--- a/docs/CP5_Respira+_Documentacao.docx
+++ b/docs/CP5_Respira+_Documentacao.docx
@@ -2877,13 +2877,14 @@
       <w:pPr>
         <w:spacing w:after="220"/>
       </w:pPr>
-      <w:r>
-        <w:rPr>
-          <w:i/>
-          <w:color w:val="B8860B"/>
-        </w:rPr>
-        <w:t xml:space="preserve">[Link do vídeo de apresentação do CP5 — a adicionar após a gravação]</w:t>
-      </w:r>
+      <w:hyperlink r:id="rId22" w:history="1">
+        <w:r>
+          <w:rPr>
+            <w:rStyle w:val="Hyperlink"/>
+          </w:rPr>
+          <w:t>Vídeo de apresentação do checkpoint — YouTube</w:t>
+        </w:r>
+      </w:hyperlink>
     </w:p>
     <w:p>
       <w:pPr>

</xml_diff>